<commit_message>
docs: update time table and documentation
</commit_message>
<xml_diff>
--- a/docs/Squad App Frontend IPA Dokumentation.docx
+++ b/docs/Squad App Frontend IPA Dokumentation.docx
@@ -10814,6 +10814,42 @@
                 <w:rFonts w:cs="Arial"/>
               </w:rPr>
             </w:pPr>
+            <w:r>
+              <w:rPr>
+                <w:rFonts w:cs="Arial"/>
+              </w:rPr>
+              <w:t>Seitenstruktur erstellen</w:t>
+            </w:r>
+            <w:r>
+              <w:rPr>
+                <w:rFonts w:cs="Arial"/>
+              </w:rPr>
+              <w:t xml:space="preserve"> (1h), </w:t>
+            </w:r>
+            <w:r>
+              <w:rPr>
+                <w:rFonts w:cs="Arial"/>
+              </w:rPr>
+              <w:t>Backend Verknüpfung anlegen</w:t>
+            </w:r>
+            <w:r>
+              <w:rPr>
+                <w:rFonts w:cs="Arial"/>
+              </w:rPr>
+              <w:t xml:space="preserve"> (2h), </w:t>
+            </w:r>
+            <w:r>
+              <w:rPr>
+                <w:rFonts w:cs="Arial"/>
+              </w:rPr>
+              <w:t>Authentifizierung mit NextAuth</w:t>
+            </w:r>
+            <w:r>
+              <w:rPr>
+                <w:rFonts w:cs="Arial"/>
+              </w:rPr>
+              <w:t xml:space="preserve"> (4h), Dokumentation (1h)</w:t>
+            </w:r>
           </w:p>
         </w:tc>
       </w:tr>
@@ -10853,6 +10889,12 @@
                 <w:rFonts w:cs="Arial"/>
               </w:rPr>
             </w:pPr>
+            <w:r>
+              <w:rPr>
+                <w:rFonts w:cs="Arial"/>
+              </w:rPr>
+              <w:t>Keine</w:t>
+            </w:r>
           </w:p>
         </w:tc>
       </w:tr>
@@ -10892,6 +10934,37 @@
                 <w:rFonts w:cs="Arial"/>
               </w:rPr>
             </w:pPr>
+            <w:r>
+              <w:rPr>
+                <w:rFonts w:cs="Arial"/>
+              </w:rPr>
+              <w:t>Login eingebaut und geschützten Admin Bereich erstellt.</w:t>
+            </w:r>
+          </w:p>
+          <w:p>
+            <w:pPr>
+              <w:rPr>
+                <w:rFonts w:cs="Arial"/>
+              </w:rPr>
+            </w:pPr>
+            <w:r>
+              <w:rPr>
+                <w:rFonts w:cs="Arial"/>
+              </w:rPr>
+              <w:t xml:space="preserve">Verbindung zum NestJS Backend </w:t>
+            </w:r>
+            <w:r>
+              <w:rPr>
+                <w:rFonts w:cs="Arial"/>
+              </w:rPr>
+              <w:t xml:space="preserve">erfolgreich </w:t>
+            </w:r>
+            <w:r>
+              <w:rPr>
+                <w:rFonts w:cs="Arial"/>
+              </w:rPr>
+              <w:t>hergestellt.</w:t>
+            </w:r>
           </w:p>
         </w:tc>
       </w:tr>
@@ -10937,6 +11010,44 @@
                 <w:rFonts w:cs="Arial"/>
               </w:rPr>
             </w:pPr>
+            <w:r>
+              <w:rPr>
+                <w:rFonts w:cs="Arial"/>
+              </w:rPr>
+              <w:t>Für NextAuth werden in den Environment Variablen der Benutzername und das Passwort abgespeichert. Für den Benutzernamen setzte ich die Variable USERNAME.</w:t>
+            </w:r>
+          </w:p>
+          <w:p>
+            <w:pPr>
+              <w:rPr>
+                <w:rFonts w:cs="Arial"/>
+              </w:rPr>
+            </w:pPr>
+          </w:p>
+          <w:p>
+            <w:pPr>
+              <w:rPr>
+                <w:rFonts w:cs="Arial"/>
+              </w:rPr>
+            </w:pPr>
+            <w:r>
+              <w:rPr>
+                <w:rFonts w:cs="Arial"/>
+              </w:rPr>
+              <w:t xml:space="preserve">Dies stellte sich als suboptimal </w:t>
+            </w:r>
+            <w:r>
+              <w:rPr>
+                <w:rFonts w:cs="Arial"/>
+              </w:rPr>
+              <w:t>her</w:t>
+            </w:r>
+            <w:r>
+              <w:rPr>
+                <w:rFonts w:cs="Arial"/>
+              </w:rPr>
+              <w:t xml:space="preserve">aus. Beim Versuch mich einzuloggen, erhielt ich nämlich immer eine Fehlermeldung. </w:t>
+            </w:r>
           </w:p>
         </w:tc>
       </w:tr>
@@ -10969,6 +11080,38 @@
                 <w:rFonts w:cs="Arial"/>
               </w:rPr>
             </w:pPr>
+            <w:r>
+              <w:rPr>
+                <w:rFonts w:cs="Arial"/>
+              </w:rPr>
+              <w:t xml:space="preserve">Nachdem ich alle Dateien, die für NextAuth notwendig sind, studiert hatte, war ich überzeugt, dass mein Code richtig ist. Ich entschied mich mit zwei Console Logs die von mir eingegebenen Daten mit deren der Environment Variablen zu vergleichen und stellte fest, dass </w:t>
+            </w:r>
+            <w:r>
+              <w:rPr>
+                <w:rFonts w:cs="Arial"/>
+              </w:rPr>
+              <w:t>USERNAME flurinbandli zurückgab.</w:t>
+            </w:r>
+          </w:p>
+          <w:p>
+            <w:pPr>
+              <w:rPr>
+                <w:rFonts w:cs="Arial"/>
+              </w:rPr>
+            </w:pPr>
+          </w:p>
+          <w:p>
+            <w:pPr>
+              <w:rPr>
+                <w:rFonts w:cs="Arial"/>
+              </w:rPr>
+            </w:pPr>
+            <w:r>
+              <w:rPr>
+                <w:rFonts w:cs="Arial"/>
+              </w:rPr>
+              <w:t>Also nicht, was ich abgespeichert hatte, sondern meinen Windows Usernamen. Durch Änderung von USERNAME auf AUTH_USERNAME funktionierte alles wie es sollte.</w:t>
+            </w:r>
           </w:p>
         </w:tc>
       </w:tr>
@@ -11001,6 +11144,12 @@
                 <w:rFonts w:cs="Arial"/>
               </w:rPr>
             </w:pPr>
+            <w:r>
+              <w:rPr>
+                <w:rFonts w:cs="Arial"/>
+              </w:rPr>
+              <w:t>Login getestet, Fehlermeldungen bei ungültigem Login angeschaut, Verbindung zum Backend mit Console Log sichergestellt.</w:t>
+            </w:r>
           </w:p>
         </w:tc>
       </w:tr>
@@ -11033,6 +11182,21 @@
                 <w:rFonts w:cs="Arial"/>
               </w:rPr>
             </w:pPr>
+            <w:r>
+              <w:rPr>
+                <w:rFonts w:cs="Arial"/>
+              </w:rPr>
+              <w:t xml:space="preserve">Dokumentation von NextAuth als Unterstützung bei Einbau von Nextauth verwendet </w:t>
+            </w:r>
+            <w:hyperlink r:id="rId22" w:history="1">
+              <w:r>
+                <w:rPr>
+                  <w:rStyle w:val="Hyperlink"/>
+                  <w:rFonts w:cs="Arial"/>
+                </w:rPr>
+                <w:t>https://authjs.dev/getting-started/installation?framework=Next.js</w:t>
+              </w:r>
+            </w:hyperlink>
           </w:p>
         </w:tc>
       </w:tr>
@@ -11065,6 +11229,12 @@
                 <w:rFonts w:cs="Arial"/>
               </w:rPr>
             </w:pPr>
+            <w:r>
+              <w:rPr>
+                <w:rFonts w:cs="Arial"/>
+              </w:rPr>
+              <w:t>KI gefragt, wieso sich USERNAME nicht ändern lässt. Windows setzt USERNAME automatisch als Systemvariable, welche sich nicht durch eine Environment Variable überschreiben lässt.</w:t>
+            </w:r>
           </w:p>
         </w:tc>
       </w:tr>
@@ -11097,6 +11267,12 @@
                 <w:rFonts w:cs="Arial"/>
               </w:rPr>
             </w:pPr>
+            <w:r>
+              <w:rPr>
+                <w:rFonts w:cs="Arial"/>
+              </w:rPr>
+              <w:t>Etwa eine halbe Stunde vor dem Zeitplan. Ich brauchte bei der Implementierung von NextAuth und der Dokumentation etwas länger als geplant.</w:t>
+            </w:r>
           </w:p>
         </w:tc>
       </w:tr>
@@ -11129,6 +11305,32 @@
                 <w:rFonts w:cs="Arial"/>
               </w:rPr>
             </w:pPr>
+            <w:r>
+              <w:rPr>
+                <w:rFonts w:cs="Arial"/>
+              </w:rPr>
+              <w:t>Super in den Tag gestartet. Ich hatte vorher etwas Angst, dass ich mehr Zeit für die Backend Verbindung benötigen würde, ich brauchte jedoch ungefähr genau so lange wie dafür vorgesehen.</w:t>
+            </w:r>
+          </w:p>
+          <w:p>
+            <w:pPr>
+              <w:rPr>
+                <w:rFonts w:cs="Arial"/>
+              </w:rPr>
+            </w:pPr>
+          </w:p>
+          <w:p>
+            <w:pPr>
+              <w:rPr>
+                <w:rFonts w:cs="Arial"/>
+              </w:rPr>
+            </w:pPr>
+            <w:r>
+              <w:rPr>
+                <w:rFonts w:cs="Arial"/>
+              </w:rPr>
+              <w:t xml:space="preserve">Bei NextAuth hatte ich ein Problem mit den Environment Variablen, was mich etwas Zeit gekostet hat. Dafür weiss ich nun, dass USERNAME sich nicht ändern lässt. </w:t>
+            </w:r>
           </w:p>
         </w:tc>
       </w:tr>
@@ -16533,7 +16735,7 @@
                     </pic:cNvPicPr>
                   </pic:nvPicPr>
                   <pic:blipFill>
-                    <a:blip r:embed="rId22">
+                    <a:blip r:embed="rId23">
                       <a:extLst>
                         <a:ext uri="{28A0092B-C50C-407E-A947-70E740481C1C}">
                           <a14:useLocalDpi xmlns:a14="http://schemas.microsoft.com/office/drawing/2010/main" val="0"/>
@@ -16660,7 +16862,7 @@
                     </pic:cNvPicPr>
                   </pic:nvPicPr>
                   <pic:blipFill>
-                    <a:blip r:embed="rId23">
+                    <a:blip r:embed="rId24">
                       <a:extLst>
                         <a:ext uri="{28A0092B-C50C-407E-A947-70E740481C1C}">
                           <a14:useLocalDpi xmlns:a14="http://schemas.microsoft.com/office/drawing/2010/main" val="0"/>
@@ -16886,13 +17088,7 @@
         <w:rPr>
           <w:rFonts w:ascii="Arial" w:hAnsi="Arial" w:cs="Arial"/>
         </w:rPr>
-        <w:t xml:space="preserve">Das Testen wird entweder von Hand oder mithilfe von Playwright durchgeführt. Es wird ausschliesslich als Blackbox getestet. </w:t>
-      </w:r>
-      <w:r>
-        <w:rPr>
-          <w:rFonts w:ascii="Arial" w:hAnsi="Arial" w:cs="Arial"/>
-        </w:rPr>
-        <w:t>Der Quellcode wird nicht explizit angeschaut, sondern die Funktionen werden Schritt für Schritt ausprobiert und der Istzustand mit dem Sollzustand verglichen.</w:t>
+        <w:t>Das Testen wird entweder von Hand oder mithilfe von Playwright durchgeführt. Es wird ausschliesslich als Blackbox getestet. Der Quellcode wird nicht explizit angeschaut, sondern die Funktionen werden Schritt für Schritt ausprobiert und der Istzustand mit dem Sollzustand verglichen.</w:t>
       </w:r>
       <w:r>
         <w:rPr>
@@ -17244,7 +17440,7 @@
         </w:rPr>
         <w:t>4. Applikation im Browser öffnen (</w:t>
       </w:r>
-      <w:hyperlink r:id="rId24" w:history="1">
+      <w:hyperlink r:id="rId25" w:history="1">
         <w:r>
           <w:rPr>
             <w:rStyle w:val="Hyperlink"/>
@@ -17316,13 +17512,7 @@
           <w:rFonts w:ascii="Arial" w:hAnsi="Arial" w:cs="Arial"/>
         </w:rPr>
         <w:lastRenderedPageBreak/>
-        <w:t xml:space="preserve">Getestet werden die im Projektauftrag definierten Kernfunktionen: Login/Logout, CRUD von Teams, Spieler und Trainer und die öffentliche Ansicht. Die Datenbank und das Backend werden nicht getestet, lediglich dass das Verwalten von Daten funktioniert. Die Web-Applikation wird nur auf Desktop Grösse getestet und nicht auf Mobile oder Tablet Grösse. </w:t>
-      </w:r>
-      <w:r>
-        <w:rPr>
-          <w:rFonts w:ascii="Arial" w:hAnsi="Arial" w:cs="Arial"/>
-        </w:rPr>
-        <w:t xml:space="preserve">Dies da Mobile und Tablet Versionen nicht explizit gefordert sind und die Zeit dafür zu knapp ist. Die Performance wird ebenfalls nicht </w:t>
+        <w:t xml:space="preserve">Getestet werden die im Projektauftrag definierten Kernfunktionen: Login/Logout, CRUD von Teams, Spieler und Trainer und die öffentliche Ansicht. Die Datenbank und das Backend werden nicht getestet, lediglich dass das Verwalten von Daten funktioniert. Die Web-Applikation wird nur auf Desktop Grösse getestet und nicht auf Mobile oder Tablet Grösse. Dies da Mobile und Tablet Versionen nicht explizit gefordert sind und die Zeit dafür zu knapp ist. Die Performance wird ebenfalls nicht </w:t>
       </w:r>
       <w:r>
         <w:rPr>
@@ -17953,13 +18143,7 @@
               <w:rPr>
                 <w:rFonts w:cs="Arial"/>
               </w:rPr>
-              <w:t>Auf</w:t>
-            </w:r>
-            <w:r>
-              <w:rPr>
-                <w:rFonts w:cs="Arial"/>
-              </w:rPr>
-              <w:t xml:space="preserve"> Logout klicken</w:t>
+              <w:t>Auf Logout klicken</w:t>
             </w:r>
           </w:p>
         </w:tc>
@@ -19011,13 +19195,7 @@
         <w:rPr>
           <w:rFonts w:ascii="Arial" w:hAnsi="Arial" w:cs="Arial"/>
         </w:rPr>
-        <w:t>Anpassung</w:t>
-      </w:r>
-      <w:r>
-        <w:rPr>
-          <w:rFonts w:ascii="Arial" w:hAnsi="Arial" w:cs="Arial"/>
-        </w:rPr>
-        <w:t xml:space="preserve"> kann aufwendig sein</w:t>
+        <w:t>Anpassung kann aufwendig sein</w:t>
       </w:r>
     </w:p>
     <w:p>
@@ -19049,13 +19227,7 @@
         <w:rPr>
           <w:rFonts w:ascii="Arial" w:hAnsi="Arial" w:cs="Arial"/>
         </w:rPr>
-        <w:t xml:space="preserve">: </w:t>
-      </w:r>
-      <w:r>
-        <w:rPr>
-          <w:rFonts w:ascii="Arial" w:hAnsi="Arial" w:cs="Arial"/>
-        </w:rPr>
-        <w:t>Ant Design</w:t>
+        <w:t>: Ant Design</w:t>
       </w:r>
     </w:p>
     <w:p>
@@ -19167,13 +19339,7 @@
         <w:rPr>
           <w:rFonts w:ascii="Arial" w:hAnsi="Arial" w:cs="Arial"/>
         </w:rPr>
-        <w:t>Anpassung</w:t>
-      </w:r>
-      <w:r>
-        <w:rPr>
-          <w:rFonts w:ascii="Arial" w:hAnsi="Arial" w:cs="Arial"/>
-        </w:rPr>
-        <w:t xml:space="preserve"> kann aufwendig sein</w:t>
+        <w:t>Anpassung kann aufwendig sein</w:t>
       </w:r>
     </w:p>
     <w:p>
@@ -21390,6 +21556,421 @@
     </w:p>
     <w:p>
       <w:pPr>
+        <w:rPr>
+          <w:rFonts w:ascii="Arial" w:hAnsi="Arial" w:cs="Arial"/>
+        </w:rPr>
+      </w:pPr>
+    </w:p>
+    <w:p>
+      <w:pPr>
+        <w:rPr>
+          <w:rFonts w:ascii="Arial" w:hAnsi="Arial" w:cs="Arial"/>
+        </w:rPr>
+      </w:pPr>
+      <w:r>
+        <w:rPr>
+          <w:rFonts w:ascii="Arial" w:hAnsi="Arial" w:cs="Arial"/>
+        </w:rPr>
+        <w:t>Backend Verknüpfung anlegen</w:t>
+      </w:r>
+      <w:r>
+        <w:rPr>
+          <w:rFonts w:ascii="Arial" w:hAnsi="Arial" w:cs="Arial"/>
+        </w:rPr>
+        <w:t>:</w:t>
+      </w:r>
+    </w:p>
+    <w:p>
+      <w:pPr>
+        <w:rPr>
+          <w:rFonts w:ascii="Arial" w:hAnsi="Arial" w:cs="Arial"/>
+        </w:rPr>
+      </w:pPr>
+      <w:r>
+        <w:rPr>
+          <w:rFonts w:ascii="Arial" w:hAnsi="Arial" w:cs="Arial"/>
+        </w:rPr>
+        <w:t>Beim Studieren des zur Verfügung gestellten Backends wurde festgestellt, dass die Verbindung ein Login benötigt, welches einen Bearer Token zurückgibt</w:t>
+      </w:r>
+      <w:r>
+        <w:rPr>
+          <w:rFonts w:ascii="Arial" w:hAnsi="Arial" w:cs="Arial"/>
+        </w:rPr>
+        <w:t>. Dieser Token muss bei jeder Anfrage</w:t>
+      </w:r>
+      <w:r>
+        <w:rPr>
+          <w:rFonts w:ascii="Arial" w:hAnsi="Arial" w:cs="Arial"/>
+        </w:rPr>
+        <w:t xml:space="preserve"> im Header </w:t>
+      </w:r>
+      <w:r>
+        <w:rPr>
+          <w:rFonts w:ascii="Arial" w:hAnsi="Arial" w:cs="Arial"/>
+        </w:rPr>
+        <w:t>mitgesendet werden</w:t>
+      </w:r>
+      <w:r>
+        <w:rPr>
+          <w:rFonts w:ascii="Arial" w:hAnsi="Arial" w:cs="Arial"/>
+        </w:rPr>
+        <w:t>.</w:t>
+      </w:r>
+    </w:p>
+    <w:p>
+      <w:pPr>
+        <w:rPr>
+          <w:rFonts w:ascii="Arial" w:hAnsi="Arial" w:cs="Arial"/>
+        </w:rPr>
+      </w:pPr>
+    </w:p>
+    <w:p>
+      <w:pPr>
+        <w:rPr>
+          <w:rFonts w:ascii="Arial" w:hAnsi="Arial" w:cs="Arial"/>
+        </w:rPr>
+      </w:pPr>
+      <w:r>
+        <w:rPr>
+          <w:rFonts w:ascii="Arial" w:hAnsi="Arial" w:cs="Arial"/>
+        </w:rPr>
+        <w:t xml:space="preserve">Der Token könnte entweder bei jeder Anfrage neu erstellt werden, oder es könnte vor jeder Anfrage überprüft werden, ob ein gültiger Token bereits abgespeichert wurde. </w:t>
+      </w:r>
+      <w:r>
+        <w:rPr>
+          <w:rFonts w:ascii="Arial" w:hAnsi="Arial" w:cs="Arial"/>
+        </w:rPr>
+        <w:t xml:space="preserve">Bei jeder Anfrage einen neuen Token zu implementieren, wäre die einfachere Methode, es würden jedoch mehr Anfragen abgesendet werden. Da die öffentlichen Teams Seiten jedoch keinen Token benötigen sondern nur die geschützten Seite, wurde die einfachere Methode gewählt. </w:t>
+      </w:r>
+    </w:p>
+    <w:p>
+      <w:pPr>
+        <w:rPr>
+          <w:rFonts w:ascii="Arial" w:hAnsi="Arial" w:cs="Arial"/>
+        </w:rPr>
+      </w:pPr>
+    </w:p>
+    <w:p>
+      <w:pPr>
+        <w:rPr>
+          <w:rFonts w:ascii="Arial" w:hAnsi="Arial" w:cs="Arial"/>
+        </w:rPr>
+      </w:pPr>
+      <w:r>
+        <w:rPr>
+          <w:rFonts w:ascii="Arial" w:hAnsi="Arial" w:cs="Arial"/>
+        </w:rPr>
+        <w:t xml:space="preserve">Aus diesem Grund wurde die Datei </w:t>
+      </w:r>
+      <w:r>
+        <w:rPr>
+          <w:rFonts w:ascii="Arial" w:hAnsi="Arial" w:cs="Arial"/>
+        </w:rPr>
+        <w:t>«</w:t>
+      </w:r>
+      <w:r>
+        <w:rPr>
+          <w:rFonts w:ascii="Arial" w:hAnsi="Arial" w:cs="Arial"/>
+        </w:rPr>
+        <w:t>lib/nest-api.ts</w:t>
+      </w:r>
+      <w:r>
+        <w:rPr>
+          <w:rFonts w:ascii="Arial" w:hAnsi="Arial" w:cs="Arial"/>
+        </w:rPr>
+        <w:t>»</w:t>
+      </w:r>
+      <w:r>
+        <w:rPr>
+          <w:rFonts w:ascii="Arial" w:hAnsi="Arial" w:cs="Arial"/>
+        </w:rPr>
+        <w:t xml:space="preserve"> erstellt, welche zwei Funktionen beinhaltet. Die erste Funktion </w:t>
+      </w:r>
+      <w:r>
+        <w:rPr>
+          <w:rFonts w:ascii="Arial" w:hAnsi="Arial" w:cs="Arial"/>
+        </w:rPr>
+        <w:t>übernimmt das Login</w:t>
+      </w:r>
+      <w:r>
+        <w:rPr>
+          <w:rFonts w:ascii="Arial" w:hAnsi="Arial" w:cs="Arial"/>
+        </w:rPr>
+        <w:t xml:space="preserve"> beim NestJS Backend </w:t>
+      </w:r>
+      <w:r>
+        <w:rPr>
+          <w:rFonts w:ascii="Arial" w:hAnsi="Arial" w:cs="Arial"/>
+        </w:rPr>
+        <w:t>und sendet den vorgesehenen</w:t>
+      </w:r>
+      <w:r>
+        <w:rPr>
+          <w:rFonts w:ascii="Arial" w:hAnsi="Arial" w:cs="Arial"/>
+        </w:rPr>
+        <w:t xml:space="preserve"> Benutzernamen und</w:t>
+      </w:r>
+      <w:r>
+        <w:rPr>
+          <w:rFonts w:ascii="Arial" w:hAnsi="Arial" w:cs="Arial"/>
+        </w:rPr>
+        <w:t xml:space="preserve"> das</w:t>
+      </w:r>
+      <w:r>
+        <w:rPr>
+          <w:rFonts w:ascii="Arial" w:hAnsi="Arial" w:cs="Arial"/>
+        </w:rPr>
+        <w:t xml:space="preserve"> Passwort. </w:t>
+      </w:r>
+      <w:r>
+        <w:rPr>
+          <w:rFonts w:ascii="Arial" w:hAnsi="Arial" w:cs="Arial"/>
+        </w:rPr>
+        <w:t>Als Antwort wird ein accessToken</w:t>
+      </w:r>
+      <w:r>
+        <w:rPr>
+          <w:rFonts w:ascii="Arial" w:hAnsi="Arial" w:cs="Arial"/>
+        </w:rPr>
+        <w:t>, der für die zweite Funktion benötigt wird</w:t>
+      </w:r>
+      <w:r>
+        <w:rPr>
+          <w:rFonts w:ascii="Arial" w:hAnsi="Arial" w:cs="Arial"/>
+        </w:rPr>
+        <w:t>, zurückgegeben</w:t>
+      </w:r>
+      <w:r>
+        <w:rPr>
+          <w:rFonts w:ascii="Arial" w:hAnsi="Arial" w:cs="Arial"/>
+        </w:rPr>
+        <w:t xml:space="preserve">. </w:t>
+      </w:r>
+    </w:p>
+    <w:p>
+      <w:pPr>
+        <w:rPr>
+          <w:rFonts w:ascii="Arial" w:hAnsi="Arial" w:cs="Arial"/>
+        </w:rPr>
+      </w:pPr>
+    </w:p>
+    <w:p>
+      <w:pPr>
+        <w:rPr>
+          <w:rFonts w:ascii="Arial" w:hAnsi="Arial" w:cs="Arial"/>
+        </w:rPr>
+      </w:pPr>
+      <w:r>
+        <w:rPr>
+          <w:rFonts w:ascii="Arial" w:hAnsi="Arial" w:cs="Arial"/>
+        </w:rPr>
+        <w:t xml:space="preserve">Die zweite Funktion </w:t>
+      </w:r>
+      <w:r>
+        <w:rPr>
+          <w:rFonts w:ascii="Arial" w:hAnsi="Arial" w:cs="Arial"/>
+        </w:rPr>
+        <w:t>stellt sicher</w:t>
+      </w:r>
+      <w:r>
+        <w:rPr>
+          <w:rFonts w:ascii="Arial" w:hAnsi="Arial" w:cs="Arial"/>
+        </w:rPr>
+        <w:t xml:space="preserve">, </w:t>
+      </w:r>
+      <w:r>
+        <w:rPr>
+          <w:rFonts w:ascii="Arial" w:hAnsi="Arial" w:cs="Arial"/>
+        </w:rPr>
+        <w:t>dass zuerst das Login ausgeführt wird. Anschliessend</w:t>
+      </w:r>
+      <w:r>
+        <w:rPr>
+          <w:rFonts w:ascii="Arial" w:hAnsi="Arial" w:cs="Arial"/>
+        </w:rPr>
+        <w:t xml:space="preserve"> </w:t>
+      </w:r>
+      <w:r>
+        <w:rPr>
+          <w:rFonts w:ascii="Arial" w:hAnsi="Arial" w:cs="Arial"/>
+        </w:rPr>
+        <w:t>wird der erhaltene</w:t>
+      </w:r>
+      <w:r>
+        <w:rPr>
+          <w:rFonts w:ascii="Arial" w:hAnsi="Arial" w:cs="Arial"/>
+        </w:rPr>
+        <w:t xml:space="preserve"> accessToken </w:t>
+      </w:r>
+      <w:r>
+        <w:rPr>
+          <w:rFonts w:ascii="Arial" w:hAnsi="Arial" w:cs="Arial"/>
+        </w:rPr>
+        <w:t>abgespeichert</w:t>
+      </w:r>
+      <w:r>
+        <w:rPr>
+          <w:rFonts w:ascii="Arial" w:hAnsi="Arial" w:cs="Arial"/>
+        </w:rPr>
+        <w:t xml:space="preserve">. </w:t>
+      </w:r>
+      <w:r>
+        <w:rPr>
+          <w:rFonts w:ascii="Arial" w:hAnsi="Arial" w:cs="Arial"/>
+        </w:rPr>
+        <w:t>Bei jeder zukünftigen A</w:t>
+      </w:r>
+      <w:r>
+        <w:rPr>
+          <w:rFonts w:ascii="Arial" w:hAnsi="Arial" w:cs="Arial"/>
+        </w:rPr>
+        <w:t>nf</w:t>
+      </w:r>
+      <w:r>
+        <w:rPr>
+          <w:rFonts w:ascii="Arial" w:hAnsi="Arial" w:cs="Arial"/>
+        </w:rPr>
+        <w:t>rage</w:t>
+      </w:r>
+      <w:r>
+        <w:rPr>
+          <w:rFonts w:ascii="Arial" w:hAnsi="Arial" w:cs="Arial"/>
+        </w:rPr>
+        <w:t xml:space="preserve"> an das Backend</w:t>
+      </w:r>
+      <w:r>
+        <w:rPr>
+          <w:rFonts w:ascii="Arial" w:hAnsi="Arial" w:cs="Arial"/>
+        </w:rPr>
+        <w:t xml:space="preserve"> wird diese Funktion aufgerufen. Sie holt vor jeder Anfrage einen neuen Token und </w:t>
+      </w:r>
+      <w:r>
+        <w:rPr>
+          <w:rFonts w:ascii="Arial" w:hAnsi="Arial" w:cs="Arial"/>
+        </w:rPr>
+        <w:t>gibt</w:t>
+      </w:r>
+      <w:r>
+        <w:rPr>
+          <w:rFonts w:ascii="Arial" w:hAnsi="Arial" w:cs="Arial"/>
+        </w:rPr>
+        <w:t xml:space="preserve"> diesen im Header </w:t>
+      </w:r>
+      <w:r>
+        <w:rPr>
+          <w:rFonts w:ascii="Arial" w:hAnsi="Arial" w:cs="Arial"/>
+        </w:rPr>
+        <w:t>mit</w:t>
+      </w:r>
+      <w:r>
+        <w:rPr>
+          <w:rFonts w:ascii="Arial" w:hAnsi="Arial" w:cs="Arial"/>
+        </w:rPr>
+        <w:t>.</w:t>
+      </w:r>
+    </w:p>
+    <w:p>
+      <w:pPr>
+        <w:rPr>
+          <w:rFonts w:ascii="Arial" w:hAnsi="Arial" w:cs="Arial"/>
+        </w:rPr>
+      </w:pPr>
+    </w:p>
+    <w:p>
+      <w:pPr>
+        <w:rPr>
+          <w:rFonts w:ascii="Arial" w:hAnsi="Arial" w:cs="Arial"/>
+        </w:rPr>
+      </w:pPr>
+      <w:r>
+        <w:rPr>
+          <w:rFonts w:ascii="Arial" w:hAnsi="Arial" w:cs="Arial"/>
+        </w:rPr>
+        <w:t>Authentifizierung mit NextAuth</w:t>
+      </w:r>
+      <w:r>
+        <w:rPr>
+          <w:rFonts w:ascii="Arial" w:hAnsi="Arial" w:cs="Arial"/>
+        </w:rPr>
+        <w:t>:</w:t>
+      </w:r>
+    </w:p>
+    <w:p>
+      <w:pPr>
+        <w:rPr>
+          <w:rFonts w:ascii="Arial" w:hAnsi="Arial" w:cs="Arial"/>
+        </w:rPr>
+      </w:pPr>
+      <w:r>
+        <w:rPr>
+          <w:rFonts w:ascii="Arial" w:hAnsi="Arial" w:cs="Arial"/>
+        </w:rPr>
+        <w:lastRenderedPageBreak/>
+        <w:t>Für den geschützten Admin Bereich der Applikation wurde eine Authentifizierung mit der NextAuth Library umgesetzt. NextAuth ermöglicht eine einfache Integration von Login Mechanismen.</w:t>
+      </w:r>
+    </w:p>
+    <w:p>
+      <w:pPr>
+        <w:rPr>
+          <w:rFonts w:ascii="Arial" w:hAnsi="Arial" w:cs="Arial"/>
+        </w:rPr>
+      </w:pPr>
+    </w:p>
+    <w:p>
+      <w:pPr>
+        <w:rPr>
+          <w:rFonts w:ascii="Arial" w:hAnsi="Arial" w:cs="Arial"/>
+        </w:rPr>
+      </w:pPr>
+      <w:r>
+        <w:rPr>
+          <w:rFonts w:ascii="Arial" w:hAnsi="Arial" w:cs="Arial"/>
+        </w:rPr>
+        <w:t>Für das Login wurde ein Credentials Provider eingerichtet, welcher die eingegebenen Daten des Users mit den Daten aus den Environment Variablen vergleicht. Bei erfolgreicher Anmeldung wird eine Session erstellt und als Cookie abgespeichert.</w:t>
+      </w:r>
+    </w:p>
+    <w:p>
+      <w:pPr>
+        <w:rPr>
+          <w:rFonts w:ascii="Arial" w:hAnsi="Arial" w:cs="Arial"/>
+        </w:rPr>
+      </w:pPr>
+    </w:p>
+    <w:p>
+      <w:pPr>
+        <w:rPr>
+          <w:rFonts w:ascii="Arial" w:hAnsi="Arial" w:cs="Arial"/>
+        </w:rPr>
+      </w:pPr>
+      <w:r>
+        <w:rPr>
+          <w:rFonts w:ascii="Arial" w:hAnsi="Arial" w:cs="Arial"/>
+        </w:rPr>
+        <w:t>Die Login Seite verwendet ein Formular welches React Hook Form zur Formularverwaltung und Zod zur Validierung der Eingaben verwendet.</w:t>
+      </w:r>
+    </w:p>
+    <w:p>
+      <w:pPr>
+        <w:rPr>
+          <w:rFonts w:ascii="Arial" w:hAnsi="Arial" w:cs="Arial"/>
+        </w:rPr>
+      </w:pPr>
+    </w:p>
+    <w:p>
+      <w:pPr>
+        <w:rPr>
+          <w:rFonts w:ascii="Arial" w:hAnsi="Arial" w:cs="Arial"/>
+        </w:rPr>
+      </w:pPr>
+      <w:r>
+        <w:rPr>
+          <w:rFonts w:ascii="Arial" w:hAnsi="Arial" w:cs="Arial"/>
+        </w:rPr>
+        <w:t>Bei erfolgreicher Anmeldung wird der User in den geschützten Admin Bereich weitergeleitet. Bei Ungültiger Eingabe bleibt der User auf der Login Seite. Nicht authentifizierte User werden automatisch auf die Login Seite umgeleitet.</w:t>
+      </w:r>
+    </w:p>
+    <w:p>
+      <w:pPr>
         <w:pStyle w:val="berschrift3nummeriert"/>
         <w:rPr>
           <w:rFonts w:cs="Arial"/>
@@ -22104,7 +22685,7 @@
               </w:rPr>
               <w:t xml:space="preserve">POST: </w:t>
             </w:r>
-            <w:hyperlink r:id="rId25" w:history="1">
+            <w:hyperlink r:id="rId26" w:history="1">
               <w:r>
                 <w:rPr>
                   <w:rStyle w:val="Hyperlink"/>
@@ -24254,8 +24835,8 @@
       </w:pPr>
     </w:p>
     <w:sectPr>
-      <w:headerReference w:type="default" r:id="rId26"/>
-      <w:footerReference w:type="default" r:id="rId27"/>
+      <w:headerReference w:type="default" r:id="rId27"/>
+      <w:footerReference w:type="default" r:id="rId28"/>
       <w:pgSz w:w="11906" w:h="16838" w:code="9"/>
       <w:pgMar w:top="2835" w:right="1701" w:bottom="1134" w:left="1247" w:header="1560" w:footer="737" w:gutter="0"/>
       <w:cols w:space="708"/>
@@ -26451,7 +27032,7 @@
                               <w:sz w:val="16"/>
                               <w:szCs w:val="16"/>
                             </w:rPr>
-                            <w:t>03.03.2026</w:t>
+                            <w:t>04.03.2026</w:t>
                           </w:r>
                           <w:r>
                             <w:rPr>
@@ -26549,7 +27130,7 @@
                         <w:sz w:val="16"/>
                         <w:szCs w:val="16"/>
                       </w:rPr>
-                      <w:t>03.03.2026</w:t>
+                      <w:t>04.03.2026</w:t>
                     </w:r>
                     <w:r>
                       <w:rPr>
@@ -26831,7 +27412,7 @@
                               <w:sz w:val="16"/>
                               <w:szCs w:val="16"/>
                             </w:rPr>
-                            <w:t>03.03.2026</w:t>
+                            <w:t>04.03.2026</w:t>
                           </w:r>
                           <w:r>
                             <w:rPr>
@@ -26929,7 +27510,7 @@
                         <w:sz w:val="16"/>
                         <w:szCs w:val="16"/>
                       </w:rPr>
-                      <w:t>03.03.2026</w:t>
+                      <w:t>04.03.2026</w:t>
                     </w:r>
                     <w:r>
                       <w:rPr>
@@ -27079,7 +27660,7 @@
                               <w:sz w:val="16"/>
                               <w:szCs w:val="16"/>
                             </w:rPr>
-                            <w:t>03.03.2026</w:t>
+                            <w:t>04.03.2026</w:t>
                           </w:r>
                           <w:r>
                             <w:rPr>
@@ -27177,7 +27758,7 @@
                         <w:sz w:val="16"/>
                         <w:szCs w:val="16"/>
                       </w:rPr>
-                      <w:t>03.03.2026</w:t>
+                      <w:t>04.03.2026</w:t>
                     </w:r>
                     <w:r>
                       <w:rPr>
@@ -35163,6 +35744,7 @@
   <w:style w:type="character" w:default="1" w:styleId="Absatz-Standardschriftart">
     <w:name w:val="Default Paragraph Font"/>
     <w:uiPriority w:val="1"/>
+    <w:semiHidden/>
     <w:unhideWhenUsed/>
   </w:style>
   <w:style w:type="table" w:default="1" w:styleId="NormaleTabelle">
@@ -37436,6 +38018,12 @@
 </file>
 
 <file path=customXml/item1.xml><?xml version="1.0" encoding="utf-8"?>
+<p:properties xmlns:p="http://schemas.microsoft.com/office/2006/metadata/properties" xmlns:xsi="http://www.w3.org/2001/XMLSchema-instance" xmlns:pc="http://schemas.microsoft.com/office/infopath/2007/PartnerControls">
+  <documentManagement/>
+</p:properties>
+</file>
+
+<file path=customXml/item2.xml><?xml version="1.0" encoding="utf-8"?>
 <?mso-contentType ?>
 <FormTemplates xmlns="http://schemas.microsoft.com/sharepoint/v3/contenttype/forms">
   <Display>DocumentLibraryForm</Display>
@@ -37444,38 +38032,7 @@
 </FormTemplates>
 </file>
 
-<file path=customXml/item2.xml><?xml version="1.0" encoding="utf-8"?>
-<p:properties xmlns:p="http://schemas.microsoft.com/office/2006/metadata/properties" xmlns:xsi="http://www.w3.org/2001/XMLSchema-instance" xmlns:pc="http://schemas.microsoft.com/office/infopath/2007/PartnerControls">
-  <documentManagement/>
-</p:properties>
-</file>
-
 <file path=customXml/item3.xml><?xml version="1.0" encoding="utf-8"?>
-<b:Sources xmlns:b="http://schemas.openxmlformats.org/officeDocument/2006/bibliography" xmlns="http://schemas.openxmlformats.org/officeDocument/2006/bibliography" SelectedStyle="\APASixthEditionOfficeOnline.xsl" StyleName="APA" Version="6">
-  <b:Source>
-    <b:Tag>Authr</b:Tag>
-    <b:SourceType>Book</b:SourceType>
-    <b:Guid>{BA01FD2C-EDFC-4D13-8F46-679005D5D2FB}</b:Guid>
-    <b:Author>
-      <b:Author>
-        <b:NameList>
-          <b:Person>
-            <b:Last>Autor</b:Last>
-            <b:First>Anton</b:First>
-          </b:Person>
-        </b:NameList>
-      </b:Author>
-    </b:Author>
-    <b:Title>Titel</b:Title>
-    <b:Year>Jahr</b:Year>
-    <b:City>Ort</b:City>
-    <b:Publisher>Verleger</b:Publisher>
-    <b:RefOrder>1</b:RefOrder>
-  </b:Source>
-</b:Sources>
-</file>
-
-<file path=customXml/item4.xml><?xml version="1.0" encoding="utf-8"?>
 <ct:contentTypeSchema xmlns:ct="http://schemas.microsoft.com/office/2006/metadata/contentType" xmlns:ma="http://schemas.microsoft.com/office/2006/metadata/properties/metaAttributes" ct:_="" ma:_="" ma:contentTypeName="Dokument" ma:contentTypeID="0x0101000E5D27F8F9D77246958595755BE80D85" ma:contentTypeVersion="3" ma:contentTypeDescription="Ein neues Dokument erstellen." ma:contentTypeScope="" ma:versionID="523cc66e991d1db8e1b1ff070bf6a3d3">
   <xsd:schema xmlns:xsd="http://www.w3.org/2001/XMLSchema" xmlns:xs="http://www.w3.org/2001/XMLSchema" xmlns:p="http://schemas.microsoft.com/office/2006/metadata/properties" xmlns:ns2="17b83e7a-435f-4364-88cb-373732b2cb78" targetNamespace="http://schemas.microsoft.com/office/2006/metadata/properties" ma:root="true" ma:fieldsID="b191d266e13279e8e3bfd50054307905" ns2:_="">
     <xsd:import namespace="17b83e7a-435f-4364-88cb-373732b2cb78"/>
@@ -37613,15 +38170,32 @@
 </ct:contentTypeSchema>
 </file>
 
-<file path=customXml/itemProps1.xml><?xml version="1.0" encoding="utf-8"?>
-<ds:datastoreItem xmlns:ds="http://schemas.openxmlformats.org/officeDocument/2006/customXml" ds:itemID="{1AF5B931-A8D1-40E1-AF1E-15ECCB0C1E54}">
-  <ds:schemaRefs>
-    <ds:schemaRef ds:uri="http://schemas.microsoft.com/sharepoint/v3/contenttype/forms"/>
-  </ds:schemaRefs>
-</ds:datastoreItem>
+<file path=customXml/item4.xml><?xml version="1.0" encoding="utf-8"?>
+<b:Sources xmlns:b="http://schemas.openxmlformats.org/officeDocument/2006/bibliography" xmlns="http://schemas.openxmlformats.org/officeDocument/2006/bibliography" SelectedStyle="\APASixthEditionOfficeOnline.xsl" StyleName="APA" Version="6">
+  <b:Source>
+    <b:Tag>Authr</b:Tag>
+    <b:SourceType>Book</b:SourceType>
+    <b:Guid>{BA01FD2C-EDFC-4D13-8F46-679005D5D2FB}</b:Guid>
+    <b:Author>
+      <b:Author>
+        <b:NameList>
+          <b:Person>
+            <b:Last>Autor</b:Last>
+            <b:First>Anton</b:First>
+          </b:Person>
+        </b:NameList>
+      </b:Author>
+    </b:Author>
+    <b:Title>Titel</b:Title>
+    <b:Year>Jahr</b:Year>
+    <b:City>Ort</b:City>
+    <b:Publisher>Verleger</b:Publisher>
+    <b:RefOrder>1</b:RefOrder>
+  </b:Source>
+</b:Sources>
 </file>
 
-<file path=customXml/itemProps2.xml><?xml version="1.0" encoding="utf-8"?>
+<file path=customXml/itemProps1.xml><?xml version="1.0" encoding="utf-8"?>
 <ds:datastoreItem xmlns:ds="http://schemas.openxmlformats.org/officeDocument/2006/customXml" ds:itemID="{AEAB193A-0B35-45ED-9423-E63FC15D0D3B}">
   <ds:schemaRefs>
     <ds:schemaRef ds:uri="http://schemas.microsoft.com/office/2006/metadata/properties"/>
@@ -37630,15 +38204,15 @@
 </ds:datastoreItem>
 </file>
 
-<file path=customXml/itemProps3.xml><?xml version="1.0" encoding="utf-8"?>
-<ds:datastoreItem xmlns:ds="http://schemas.openxmlformats.org/officeDocument/2006/customXml" ds:itemID="{641A501F-5856-B74E-81EC-17AA83297DF6}">
+<file path=customXml/itemProps2.xml><?xml version="1.0" encoding="utf-8"?>
+<ds:datastoreItem xmlns:ds="http://schemas.openxmlformats.org/officeDocument/2006/customXml" ds:itemID="{1AF5B931-A8D1-40E1-AF1E-15ECCB0C1E54}">
   <ds:schemaRefs>
-    <ds:schemaRef ds:uri="http://schemas.openxmlformats.org/officeDocument/2006/bibliography"/>
+    <ds:schemaRef ds:uri="http://schemas.microsoft.com/sharepoint/v3/contenttype/forms"/>
   </ds:schemaRefs>
 </ds:datastoreItem>
 </file>
 
-<file path=customXml/itemProps4.xml><?xml version="1.0" encoding="utf-8"?>
+<file path=customXml/itemProps3.xml><?xml version="1.0" encoding="utf-8"?>
 <ds:datastoreItem xmlns:ds="http://schemas.openxmlformats.org/officeDocument/2006/customXml" ds:itemID="{5EFF464D-8F80-4371-B44D-92E0D76AD7B0}">
   <ds:schemaRefs>
     <ds:schemaRef ds:uri="http://schemas.microsoft.com/office/2006/metadata/contentType"/>
@@ -37654,4 +38228,12 @@
     <ds:schemaRef ds:uri="http://schemas.microsoft.com/internal/obd"/>
   </ds:schemaRefs>
 </ds:datastoreItem>
+</file>
+
+<file path=customXml/itemProps4.xml><?xml version="1.0" encoding="utf-8"?>
+<ds:datastoreItem xmlns:ds="http://schemas.openxmlformats.org/officeDocument/2006/customXml" ds:itemID="{641A501F-5856-B74E-81EC-17AA83297DF6}">
+  <ds:schemaRefs>
+    <ds:schemaRef ds:uri="http://schemas.openxmlformats.org/officeDocument/2006/bibliography"/>
+  </ds:schemaRefs>
+</ds:datastoreItem>
 </file>
</xml_diff>

<commit_message>
feat: add squad management overview page
</commit_message>
<xml_diff>
--- a/docs/Squad App Frontend IPA Dokumentation.docx
+++ b/docs/Squad App Frontend IPA Dokumentation.docx
@@ -11439,6 +11439,12 @@
                 <w:rFonts w:cs="Arial"/>
               </w:rPr>
             </w:pPr>
+            <w:r>
+              <w:rPr>
+                <w:rFonts w:cs="Arial"/>
+              </w:rPr>
+              <w:t>Backend Layout kreieren (4h), Dokumentation (2h), Backend Squad Bereich erstellen (2h)</w:t>
+            </w:r>
           </w:p>
         </w:tc>
       </w:tr>
@@ -11478,6 +11484,12 @@
                 <w:rFonts w:cs="Arial"/>
               </w:rPr>
             </w:pPr>
+            <w:r>
+              <w:rPr>
+                <w:rFonts w:cs="Arial"/>
+              </w:rPr>
+              <w:t>Keine</w:t>
+            </w:r>
           </w:p>
         </w:tc>
       </w:tr>
@@ -11517,6 +11529,86 @@
                 <w:rFonts w:cs="Arial"/>
               </w:rPr>
             </w:pPr>
+            <w:r>
+              <w:rPr>
+                <w:rFonts w:cs="Arial"/>
+              </w:rPr>
+              <w:t xml:space="preserve">Die </w:t>
+            </w:r>
+            <w:r>
+              <w:rPr>
+                <w:rFonts w:cs="Arial"/>
+              </w:rPr>
+              <w:t xml:space="preserve">Navigation auf der linken Seite </w:t>
+            </w:r>
+            <w:r>
+              <w:rPr>
+                <w:rFonts w:cs="Arial"/>
+              </w:rPr>
+              <w:t>wurde implementiert und funktioniert wie geplant</w:t>
+            </w:r>
+            <w:r>
+              <w:rPr>
+                <w:rFonts w:cs="Arial"/>
+              </w:rPr>
+              <w:t>.</w:t>
+            </w:r>
+          </w:p>
+          <w:p>
+            <w:pPr>
+              <w:rPr>
+                <w:rFonts w:cs="Arial"/>
+              </w:rPr>
+            </w:pPr>
+            <w:r>
+              <w:rPr>
+                <w:rFonts w:cs="Arial"/>
+              </w:rPr>
+              <w:t>Der Logout-Button wurde im Layout integriert.</w:t>
+            </w:r>
+          </w:p>
+          <w:p>
+            <w:pPr>
+              <w:rPr>
+                <w:rFonts w:cs="Arial"/>
+              </w:rPr>
+            </w:pPr>
+            <w:r>
+              <w:rPr>
+                <w:rFonts w:cs="Arial"/>
+              </w:rPr>
+              <w:t xml:space="preserve">Die </w:t>
+            </w:r>
+            <w:r>
+              <w:rPr>
+                <w:rFonts w:cs="Arial"/>
+              </w:rPr>
+              <w:t xml:space="preserve">Übersichtsseite </w:t>
+            </w:r>
+            <w:r>
+              <w:rPr>
+                <w:rFonts w:cs="Arial"/>
+              </w:rPr>
+              <w:t>im Team</w:t>
+            </w:r>
+            <w:r>
+              <w:rPr>
+                <w:rFonts w:cs="Arial"/>
+              </w:rPr>
+              <w:t xml:space="preserve"> Bereich</w:t>
+            </w:r>
+            <w:r>
+              <w:rPr>
+                <w:rFonts w:cs="Arial"/>
+              </w:rPr>
+              <w:t xml:space="preserve"> wurde</w:t>
+            </w:r>
+            <w:r>
+              <w:rPr>
+                <w:rFonts w:cs="Arial"/>
+              </w:rPr>
+              <w:t xml:space="preserve"> erstellt.</w:t>
+            </w:r>
           </w:p>
         </w:tc>
       </w:tr>
@@ -11562,6 +11654,62 @@
                 <w:rFonts w:cs="Arial"/>
               </w:rPr>
             </w:pPr>
+            <w:r>
+              <w:rPr>
+                <w:rFonts w:cs="Arial"/>
+              </w:rPr>
+              <w:t>Da keine genauen Vorgaben zur UI vorgegeben wurden, war unklar an welcher Stelle der Logout</w:t>
+            </w:r>
+            <w:r>
+              <w:rPr>
+                <w:rFonts w:cs="Arial"/>
+              </w:rPr>
+              <w:t>-</w:t>
+            </w:r>
+            <w:r>
+              <w:rPr>
+                <w:rFonts w:cs="Arial"/>
+              </w:rPr>
+              <w:t>Button platziert werden sollte.</w:t>
+            </w:r>
+          </w:p>
+          <w:p>
+            <w:pPr>
+              <w:rPr>
+                <w:rFonts w:cs="Arial"/>
+              </w:rPr>
+            </w:pPr>
+            <w:r>
+              <w:rPr>
+                <w:rFonts w:cs="Arial"/>
+              </w:rPr>
+              <w:br/>
+              <w:t>Es gab zwei Optionen: Entweder den Logou</w:t>
+            </w:r>
+            <w:r>
+              <w:rPr>
+                <w:rFonts w:cs="Arial"/>
+              </w:rPr>
+              <w:t>t-</w:t>
+            </w:r>
+            <w:r>
+              <w:rPr>
+                <w:rFonts w:cs="Arial"/>
+              </w:rPr>
+              <w:t xml:space="preserve"> Button oben rechts im Header platzieren oder den Logout</w:t>
+            </w:r>
+            <w:r>
+              <w:rPr>
+                <w:rFonts w:cs="Arial"/>
+              </w:rPr>
+              <w:t>-</w:t>
+            </w:r>
+            <w:r>
+              <w:rPr>
+                <w:rFonts w:cs="Arial"/>
+              </w:rPr>
+              <w:t>Button unten in der Sidebar Navigation zu platzieren.</w:t>
+            </w:r>
           </w:p>
         </w:tc>
       </w:tr>
@@ -11594,6 +11742,79 @@
                 <w:rFonts w:cs="Arial"/>
               </w:rPr>
             </w:pPr>
+            <w:r>
+              <w:rPr>
+                <w:rFonts w:cs="Arial"/>
+              </w:rPr>
+              <w:t>Falls der Logout</w:t>
+            </w:r>
+            <w:r>
+              <w:rPr>
+                <w:rFonts w:cs="Arial"/>
+              </w:rPr>
+              <w:t>-</w:t>
+            </w:r>
+            <w:r>
+              <w:rPr>
+                <w:rFonts w:cs="Arial"/>
+              </w:rPr>
+              <w:t xml:space="preserve">Button </w:t>
+            </w:r>
+            <w:r>
+              <w:rPr>
+                <w:rFonts w:cs="Arial"/>
+              </w:rPr>
+              <w:t>im Header</w:t>
+            </w:r>
+            <w:r>
+              <w:rPr>
+                <w:rFonts w:cs="Arial"/>
+              </w:rPr>
+              <w:t xml:space="preserve"> platziert wäre, müsste </w:t>
+            </w:r>
+            <w:r>
+              <w:rPr>
+                <w:rFonts w:cs="Arial"/>
+              </w:rPr>
+              <w:t>dieser</w:t>
+            </w:r>
+            <w:r>
+              <w:rPr>
+                <w:rFonts w:cs="Arial"/>
+              </w:rPr>
+              <w:t xml:space="preserve"> entweder fixiert werden, oder der User müsste</w:t>
+            </w:r>
+            <w:r>
+              <w:rPr>
+                <w:rFonts w:cs="Arial"/>
+              </w:rPr>
+              <w:t xml:space="preserve"> gegeben Falls nach oben scrollen</w:t>
+            </w:r>
+            <w:r>
+              <w:rPr>
+                <w:rFonts w:cs="Arial"/>
+              </w:rPr>
+              <w:t>.</w:t>
+            </w:r>
+          </w:p>
+          <w:p>
+            <w:pPr>
+              <w:rPr>
+                <w:rFonts w:cs="Arial"/>
+              </w:rPr>
+            </w:pPr>
+            <w:r>
+              <w:rPr>
+                <w:rFonts w:cs="Arial"/>
+              </w:rPr>
+              <w:t xml:space="preserve">In der Sidebar Navigation würde dieses Problem nicht auftreten und der Button passt besser ins Erscheinungsbild. </w:t>
+            </w:r>
+            <w:r>
+              <w:rPr>
+                <w:rFonts w:cs="Arial"/>
+              </w:rPr>
+              <w:t>Aus diesen Gründen wird der Logout-Button in der Sidebar platziert.</w:t>
+            </w:r>
           </w:p>
         </w:tc>
       </w:tr>
@@ -11626,6 +11847,12 @@
                 <w:rFonts w:cs="Arial"/>
               </w:rPr>
             </w:pPr>
+            <w:r>
+              <w:rPr>
+                <w:rFonts w:cs="Arial"/>
+              </w:rPr>
+              <w:t>Was passiert, wenn das Backend nicht erreichbar ist mit der Teams Seite? Die Fehlermeldung «Backend nicht erreichbar» wird angezeigt.</w:t>
+            </w:r>
           </w:p>
         </w:tc>
       </w:tr>
@@ -11658,6 +11885,21 @@
                 <w:rFonts w:cs="Arial"/>
               </w:rPr>
             </w:pPr>
+            <w:r>
+              <w:rPr>
+                <w:rFonts w:cs="Arial"/>
+              </w:rPr>
+              <w:t xml:space="preserve">Die Dokumentation der shadcn/ui Komponente Sidebar wurde bei der Erstellung der Sidebar Navigation als Unterstützung verwendet. </w:t>
+            </w:r>
+            <w:hyperlink r:id="rId23" w:history="1">
+              <w:r>
+                <w:rPr>
+                  <w:rStyle w:val="Hyperlink"/>
+                  <w:rFonts w:cs="Arial"/>
+                </w:rPr>
+                <w:t>https://ui.shadcn.com/docs/components/radix/sidebar</w:t>
+              </w:r>
+            </w:hyperlink>
           </w:p>
         </w:tc>
       </w:tr>
@@ -11690,6 +11932,12 @@
                 <w:rFonts w:cs="Arial"/>
               </w:rPr>
             </w:pPr>
+            <w:r>
+              <w:rPr>
+                <w:rFonts w:cs="Arial"/>
+              </w:rPr>
+              <w:t>Keine</w:t>
+            </w:r>
           </w:p>
         </w:tc>
       </w:tr>
@@ -11722,6 +11970,60 @@
                 <w:rFonts w:cs="Arial"/>
               </w:rPr>
             </w:pPr>
+            <w:r>
+              <w:rPr>
+                <w:rFonts w:cs="Arial"/>
+              </w:rPr>
+              <w:t>Für das Backend Layout brauchte ich etwas weniger als</w:t>
+            </w:r>
+            <w:r>
+              <w:rPr>
+                <w:rFonts w:cs="Arial"/>
+              </w:rPr>
+              <w:t xml:space="preserve"> die geplanten</w:t>
+            </w:r>
+            <w:r>
+              <w:rPr>
+                <w:rFonts w:cs="Arial"/>
+              </w:rPr>
+              <w:t xml:space="preserve"> vier Stunden und da </w:t>
+            </w:r>
+            <w:r>
+              <w:rPr>
+                <w:rFonts w:cs="Arial"/>
+              </w:rPr>
+              <w:t>am</w:t>
+            </w:r>
+            <w:r>
+              <w:rPr>
+                <w:rFonts w:cs="Arial"/>
+              </w:rPr>
+              <w:t xml:space="preserve"> </w:t>
+            </w:r>
+            <w:r>
+              <w:rPr>
+                <w:rFonts w:cs="Arial"/>
+              </w:rPr>
+              <w:t xml:space="preserve">Vortag </w:t>
+            </w:r>
+            <w:r>
+              <w:rPr>
+                <w:rFonts w:cs="Arial"/>
+              </w:rPr>
+              <w:t>der Vorsprung auf den Zeitplan</w:t>
+            </w:r>
+            <w:r>
+              <w:rPr>
+                <w:rFonts w:cs="Arial"/>
+              </w:rPr>
+              <w:t xml:space="preserve"> </w:t>
+            </w:r>
+            <w:r>
+              <w:rPr>
+                <w:rFonts w:cs="Arial"/>
+              </w:rPr>
+              <w:t>etwa bei einer halben Stunde lag, liegt er jetzt bei ungefähr einer Stunde.</w:t>
+            </w:r>
           </w:p>
         </w:tc>
       </w:tr>
@@ -11754,6 +12056,12 @@
                 <w:rFonts w:cs="Arial"/>
               </w:rPr>
             </w:pPr>
+            <w:r>
+              <w:rPr>
+                <w:rFonts w:cs="Arial"/>
+              </w:rPr>
+              <w:t>Ich war heute vor allem nach dem Mittag etwas erschöpft, da ich gestern Abend ein sehr schlechtes Fussballspiel ansehen musste. Mit der heutigen geleisteten Arbeit bin ich nichts destotrotz zufrieden.</w:t>
+            </w:r>
           </w:p>
         </w:tc>
       </w:tr>
@@ -16733,7 +17041,7 @@
                     </pic:cNvPicPr>
                   </pic:nvPicPr>
                   <pic:blipFill>
-                    <a:blip r:embed="rId23">
+                    <a:blip r:embed="rId24">
                       <a:extLst>
                         <a:ext uri="{28A0092B-C50C-407E-A947-70E740481C1C}">
                           <a14:useLocalDpi xmlns:a14="http://schemas.microsoft.com/office/drawing/2010/main" val="0"/>
@@ -16860,7 +17168,7 @@
                     </pic:cNvPicPr>
                   </pic:nvPicPr>
                   <pic:blipFill>
-                    <a:blip r:embed="rId24">
+                    <a:blip r:embed="rId25">
                       <a:extLst>
                         <a:ext uri="{28A0092B-C50C-407E-A947-70E740481C1C}">
                           <a14:useLocalDpi xmlns:a14="http://schemas.microsoft.com/office/drawing/2010/main" val="0"/>
@@ -17438,7 +17746,7 @@
         </w:rPr>
         <w:t>4. Applikation im Browser öffnen (</w:t>
       </w:r>
-      <w:hyperlink r:id="rId25" w:history="1">
+      <w:hyperlink r:id="rId26" w:history="1">
         <w:r>
           <w:rPr>
             <w:rStyle w:val="Hyperlink"/>
@@ -22777,7 +23085,7 @@
               </w:rPr>
               <w:t xml:space="preserve">POST: </w:t>
             </w:r>
-            <w:hyperlink r:id="rId26" w:history="1">
+            <w:hyperlink r:id="rId27" w:history="1">
               <w:r>
                 <w:rPr>
                   <w:rStyle w:val="Hyperlink"/>
@@ -24927,8 +25235,8 @@
       </w:pPr>
     </w:p>
     <w:sectPr>
-      <w:headerReference w:type="default" r:id="rId27"/>
-      <w:footerReference w:type="default" r:id="rId28"/>
+      <w:headerReference w:type="default" r:id="rId28"/>
+      <w:footerReference w:type="default" r:id="rId29"/>
       <w:pgSz w:w="11906" w:h="16838" w:code="9"/>
       <w:pgMar w:top="2835" w:right="1701" w:bottom="1134" w:left="1247" w:header="1560" w:footer="737" w:gutter="0"/>
       <w:cols w:space="708"/>

</xml_diff>